<commit_message>
Restore locked analysis plans and tidy pages and code downloads
</commit_message>
<xml_diff>
--- a/projects/diabetes-definition-audit/downloads/manuscript.docx
+++ b/projects/diabetes-definition-audit/downloads/manuscript.docx
@@ -395,7 +395,7 @@
           <w:rFonts w:ascii="Times New Roman" w:hAnsi="Times New Roman"/>
           <w:color w:val="000000"/>
         </w:rPr>
-        <w:t>I designed the study, wrote and reviewed the code, performed and checked the analyses, and reviewed the results, references and manuscript. Claude Code (Anthropic) and ChatGPT (OpenAI) assisted with software development, data analysis, literature searching and manuscript preparation. Codex (OpenAI) assisted with code and result checks, editorial revision and document formatting. I take full responsibility for the work.</w:t>
+        <w:t>I designed the study, wrote and reviewed the code, performed and checked the analyses, and reviewed the results, references and manuscript. Claude Code (Anthropic) and ChatGPT (OpenAI) assisted with coding, data analysis, literature searching and manuscript preparation. Codex (OpenAI) assisted with code and result checks, editorial revision and document formatting. I take full responsibility for the work.</w:t>
       </w:r>
     </w:p>
     <w:bookmarkEnd w:id="22"/>
@@ -1065,7 +1065,7 @@
           <w:rFonts w:ascii="Times New Roman" w:hAnsi="Times New Roman"/>
           <w:color w:val="000000"/>
         </w:rPr>
-        <w:t xml:space="preserve">The composite, diagnosed, and undiagnosed estimates matched NCHS Data Brief 516 in all 18 published rows (overall, by sex, and by three age groups) for sample size, percent, and standard error to the published rounding (Additional file 1, Table S5). Korn-Graubard intervals matched in 17 of 18 rows. For diagnosed diabetes at ages 40-59, the interval here was 9.8 to 14.7 and the published interval 10.0 to 14.5. The difference came from capping the effective sample size at the actual sample size, as the NCHS presentation standards specify [34]; without the cap the interval was 10.0 to 14.5, matching the publication.</w:t>
+        <w:t xml:space="preserve">The composite, diagnosed, and undiagnosed estimates matched NCHS Data Brief 516 in all 18 published rows (overall, by sex, and by three age groups) for sample size, percent, and standard error to the published rounding (Additional file 1, Table S5). Korn-Graubard intervals matched in 17 of 18 rows. For diagnosed diabetes at ages 40 to 59, the interval here was 9.8 to 14.7 and the published interval 10.0 to 14.5. The difference came from capping the effective sample size at the actual sample size, as the NCHS presentation standards specify [34]; without the cap the interval was 10.0 to 14.5, matching the publication.</w:t>
       </w:r>
     </w:p>
     <w:bookmarkEnd w:id="38"/>
@@ -1121,7 +1121,7 @@
           <w:rFonts w:ascii="Times New Roman" w:hAnsi="Times New Roman"/>
           <w:color w:val="000000"/>
         </w:rPr>
-        <w:t xml:space="preserve">The paired difference ranged from −1.1 to 0.0 points across age and sex groups, with every interval between −3.5 and +1.5 points (Additional file 1, Table S6 and Figure S1). For race and Hispanic origin groups, 2 component estimates (Non-Hispanic Asian and Non-Hispanic Black adults) were suppressed under the NCHS standards; those group differences are shown in Additional file 1 for completeness and are not interpreted.</w:t>
+        <w:t xml:space="preserve">The paired difference ranged from −1.1 to 0.0 points across age and sex groups, with every interval between −3.5 and +1.5 points (Additional file 1, Table S6 and Figure S1). For race and Hispanic origin groups, 2 component estimates (non-Hispanic Asian and non-Hispanic Black adults) were suppressed under the NCHS standards; those group differences are shown in Additional file 1 for completeness and are not interpreted.</w:t>
       </w:r>
     </w:p>
     <w:bookmarkEnd w:id="40"/>
@@ -1244,7 +1244,7 @@
           <w:rFonts w:ascii="Times New Roman" w:hAnsi="Times New Roman"/>
           <w:color w:val="000000"/>
         </w:rPr>
-        <w:t xml:space="preserve">Each test was measured once, so positivity on a single test is not a confirmed diagnosis [3, 38]. Positivity on both tests in the same sample meets the ADA laboratory confirmation rule [3], but no participant was clinically evaluated. Diagnosis was self-reported, and self-reports of diabetes can be inconsistent over time [39], so some misclassification is likely. The borderline category was coded as not diagnosed.</w:t>
+        <w:t xml:space="preserve">Each test was measured once, so positivity on a single test is not a confirmed diagnosis [3, 38]. Positivity on both tests in the same sample meets the American Diabetes Association laboratory confirmation rule [3], but no participant was clinically evaluated. Diagnosis was self-reported, and self-reports of diabetes can be inconsistent over time [39], so some misclassification is likely. The borderline category was coded as not diagnosed.</w:t>
       </w:r>
     </w:p>
     <w:p>
@@ -1283,7 +1283,7 @@
           <w:rFonts w:ascii="Times New Roman" w:hAnsi="Times New Roman"/>
           <w:color w:val="000000"/>
         </w:rPr>
-        <w:t xml:space="preserve">Item nonresponse was not reweighted. It was small in 2021 to 2023 (25 of 5,754 adults with a phlebotomy weight had no HbA1c result), but in 2017 to March 2020 451 of 8,451 adults in A (5.3% unweighted; 4.2% weighted) lacked HbA1c under an examination weight that does not account for it. The unweighted share exceeds the 5 percent level set in the plan.</w:t>
+        <w:t xml:space="preserve">Item nonresponse was not reweighted. It was small in 2021 to 2023 (25 of 5,754 adults with a phlebotomy weight had no HbA1c result), but in 2017 to March 2020 451 of 8,451 adults in A (5.3% unweighted; 4.2% weighted) lacked HbA1c under an examination weight that does not account for it. The unweighted share exceeds the 5% level set in the plan.</w:t>
       </w:r>
     </w:p>
     <w:p>
@@ -1353,7 +1353,7 @@
           <w:rFonts w:ascii="Times New Roman" w:hAnsi="Times New Roman"/>
           <w:color w:val="000000"/>
         </w:rPr>
-        <w:t xml:space="preserve">CI: confidence interval; FPG: fasting plasma glucose; HbA1c: glycated hemoglobin; NCHS: National Center for Health Statistics; NHANES: National Health and Nutrition Examination Survey; PSU: primary sampling unit.</w:t>
+        <w:t xml:space="preserve">AI: artificial intelligence; CI: confidence interval; DOI: digital object identifier; ERB: Ethics Review Board; FPG: fasting plasma glucose; HbA1c: glycated hemoglobin; NCHS: National Center for Health Statistics; NHANES: National Health and Nutrition Examination Survey; PSU: primary sampling unit; SHA-256: Secure Hash Algorithm 256-bit; SQL: Structured Query Language; STROBE: Strengthening the Reporting of Observational Studies in Epidemiology.</w:t>
       </w:r>
     </w:p>
     <w:bookmarkEnd w:id="46"/>
@@ -1455,7 +1455,7 @@
           <w:rFonts w:ascii="Times New Roman" w:hAnsi="Times New Roman"/>
           <w:color w:val="000000"/>
         </w:rPr>
-        <w:t>The datasets analysed during the current study are publicly available from the National Center for Health Statistics: the NHANES August 2021 to August 2023 files DEMO_L, GHB_L, GLU_L, FASTQX_L, DIQ_L, and RHQ_L and the 2017 to March 2020 pre-pandemic files P_DEMO, P_GHB, P_GLU, P_FASTQX, P_DIQ, and P_RHQ, at https://wwwn.cdc.gov/nchs/nhanes/ [16, 17, 21–30, 45]. Their use is subject to the NCHS data user agreement, which permits use for statistical reporting and analysis only and prohibits any attempt to identify participants. Participant-level files are not redistributed with this article. Additional file 2 contains the source manifest, with the download address and SHA-256 checksum of every file, and the code, SQL, configuration, phenotype specification, and analysis plan; its documented commands download the files from the NCHS pages, verify the checksums, and reproduce every reported estimate. The code and configuration checker are provided under the MIT license. Aggregate results are provided in Additional files 2 and 3.</w:t>
+        <w:t>The datasets analyzed during the current study are publicly available from the National Center for Health Statistics: the NHANES August 2021 to August 2023 files DEMO_L, GHB_L, GLU_L, FASTQX_L, DIQ_L, and RHQ_L and the 2017 to March 2020 pre-pandemic files P_DEMO, P_GHB, P_GLU, P_FASTQX, P_DIQ, and P_RHQ, at https://wwwn.cdc.gov/nchs/nhanes/ [16, 17, 21–30, 45]. Their use is subject to the NCHS data user agreement, which permits use for statistical reporting and analysis only and prohibits any attempt to identify participants. Participant-level files are not redistributed with this article. Additional file 2 contains the source manifest, with the download address and SHA-256 checksum of every file, and the code, SQL, configuration, phenotype specification, and analysis plan; its documented commands download the files from the NCHS pages, verify the checksums, and reproduce every reported estimate. The code and configuration checker are provided under the MIT license. Aggregate results are provided in Additional files 2 and 3.</w:t>
       </w:r>
     </w:p>
     <w:p>
@@ -12595,7 +12595,7 @@
           <w:rFonts w:ascii="Times New Roman" w:hAnsi="Times New Roman"/>
           <w:color w:val="000000"/>
         </w:rPr>
-        <w:t xml:space="preserve">Domain A, August 2021 to August 2023 (n = 6,022), weighted with the examination weight WTMEC2YR. Each bar splits adults into a valid fasting glucose, not assigned to the fasting subsample, assigned without a blood specimen, and assigned with a fast outside 8 to less than 24 hours. Hatched segments are suppressed under the NCHS presentation standards and are not interpreted. Cell estimates are in Additional file 1, Table S4. (File: Figure1.png)</w:t>
+        <w:t xml:space="preserve">Domain A, August 2021 to August 2023 (n = 6,022), weighted with the examination weight WTMEC2YR. Each bar splits adults into those with a valid fasting glucose, those not assigned to the fasting subsample, those assigned without a blood specimen, and those assigned with a fast outside 8 to less than 24 hours. Hatched segments are suppressed under the NCHS presentation standards and are not interpreted. Cell estimates are in Additional file 1, Table S4.</w:t>
       </w:r>
     </w:p>
     <w:p>
@@ -12624,7 +12624,7 @@
           <w:rFonts w:ascii="Times New Roman" w:hAnsi="Times New Roman"/>
           <w:color w:val="000000"/>
         </w:rPr>
-        <w:t xml:space="preserve">Domain P: n = 2,938 (August 2021 to August 2023, WTSAF2YR) and 3,757 (2017 to March 2020, WTSAFPRP). Left, weighted prevalence of HbA1c at or above 6.5% and fasting glucose at or above 126 mg/dL with 95% Korn-Graubard intervals. Right, paired difference (HbA1c minus glucose) with 95% t intervals using design degrees of freedom. (File: Figure2.png)</w:t>
+        <w:t xml:space="preserve">Domain P: n = 2,938 (August 2021 to August 2023, WTSAF2YR) and 3,757 (2017 to March 2020, WTSAFPRP). Left, weighted prevalence of HbA1c at or above 6.5% and fasting glucose at or above 126 mg/dL with 95% Korn-Graubard intervals. Right, paired difference (HbA1c minus glucose) with 95% t intervals using design degrees of freedom.</w:t>
       </w:r>
     </w:p>
     <w:p>
@@ -12653,7 +12653,7 @@
           <w:rFonts w:ascii="Times New Roman" w:hAnsi="Times New Roman"/>
           <w:color w:val="000000"/>
         </w:rPr>
-        <w:t xml:space="preserve">Left, HbA1c at or above 6.5% in domain H (WTPH2YR, n = 5,729, in 2021 to 2023; WTMECPRP, n = 8,000, in 2017 to March 2020) and in domain P (fasting subsample weight). Right, the naive difference (HbA1c in H minus glucose in P) equals the definition part (both in P) plus the sample and weight part (HbA1c in H minus HbA1c in P). The sample and weight part is a descriptive comparison. Lines are 95% intervals. (File: Figure3.png)</w:t>
+        <w:t xml:space="preserve">Left, HbA1c at or above 6.5% in domain H (WTPH2YR, n = 5,729, in 2021 to 2023; WTMECPRP, n = 8,000, in 2017 to March 2020) and in domain P (fasting subsample weight). Right, the naive difference (HbA1c in H minus glucose in P) equals the definition part (both in P) plus the sample and weight part (HbA1c in H minus HbA1c in P). The sample and weight part is a descriptive comparison. Lines are 95% intervals.</w:t>
       </w:r>
     </w:p>
     <w:p>
@@ -12682,7 +12682,7 @@
           <w:rFonts w:ascii="Times New Roman" w:hAnsi="Times New Roman"/>
           <w:color w:val="000000"/>
         </w:rPr>
-        <w:t xml:space="preserve">August 2021 to August 2023, n = 2,938, WTSAF2YR. Bars are weighted shares of all adults in domain P with 95% Korn-Graubard intervals and unweighted counts. Adults with no diagnosis and both values below threshold (84.2%) are not drawn. (File: Figure4.png)</w:t>
+        <w:t xml:space="preserve">August 2021 to August 2023, n = 2,938, WTSAF2YR. Bars are weighted shares of all adults in domain P with 95% Korn-Graubard intervals and unweighted counts. Adults with no diagnosis and both values below threshold (84.2%) are not drawn.</w:t>
       </w:r>
     </w:p>
     <w:p>
@@ -12711,7 +12711,7 @@
           <w:rFonts w:ascii="Times New Roman" w:hAnsi="Times New Roman"/>
           <w:color w:val="000000"/>
         </w:rPr>
-        <w:t xml:space="preserve">S1, narrow fasting rule (P-narrow, n = 2,766) compared with domain P; S2, single-biomarker domains H and F; S3, diagnosis, biochemical-only, and composite definitions in domain P. Weighted prevalence with 95% Korn-Graubard intervals. (File: Figure5.png)</w:t>
+        <w:t xml:space="preserve">S1, narrow fasting rule (P-narrow, n = 2,766) compared with domain P; S2, single-biomarker domains H and F; S3, diagnosis, biochemical-only, and composite definitions in domain P. Weighted prevalence with 95% Korn-Graubard intervals.</w:t>
       </w:r>
     </w:p>
     <w:bookmarkEnd w:id="92"/>

</xml_diff>

<commit_message>
Bring the reports in line with the final manuscripts
Carry the 18 October manuscript corrections into all ten reports and
project pages, replace the outdated manuscript downloads for the
evidence model and diabetes definition audits, tidy the adverse event
supplement tables, and make the peer-review status line easier to read.
</commit_message>
<xml_diff>
--- a/projects/diabetes-definition-audit/downloads/manuscript.docx
+++ b/projects/diabetes-definition-audit/downloads/manuscript.docx
@@ -43,21 +43,7 @@
           <w:bCs/>
           <w:color w:val="000000"/>
         </w:rPr>
-        <w:t xml:space="preserve">Author and affiliation: Animesh Bose, Norlowe Research</w:t>
-      </w:r>
-      <w:r>
-        <w:rPr>
-          <w:rFonts w:ascii="Times New Roman" w:hAnsi="Times New Roman"/>
-          <w:color w:val="000000"/>
-        </w:rPr>
-        <w:t xml:space="preserve"/>
-      </w:r>
-      <w:r>
-        <w:rPr>
-          <w:rFonts w:ascii="Times New Roman" w:hAnsi="Times New Roman"/>
-          <w:color w:val="000000"/>
-        </w:rPr>
-        <w:t xml:space="preserve"/>
+        <w:t>Author and affiliation: Animesh Bose, Norlowe Research</w:t>
       </w:r>
     </w:p>
     <w:p>
@@ -187,7 +173,7 @@
           <w:rFonts w:ascii="Times New Roman" w:hAnsi="Times New Roman"/>
           <w:color w:val="000000"/>
         </w:rPr>
-        <w:t xml:space="preserve">In the paired domain, 10.8% (95% CI 9.1 to 12.7) met the HbA1c threshold and 11.2% (9.5 to 13.1) the glucose threshold, a paired difference of −0.41 percentage points (−1.15 to +0.33); adults without a reported diagnosis contributed −1.12 points (−1.69 to −0.56) to that full-population difference (not prespecified). In its laboratory domain, HbA1c prevalence differed by −0.24 points (−1.44 to +0.96). Agreement was 95.0%, yet 37% of adults above either threshold exceeded only one. Of adults reporting diagnosed diabetes, 20.3% had both biomarkers below threshold. The surveillance composite (15.8%) and its parts reproduced all 18 published national point estimates. In 2017 to March 2020 the sample and weight part was +0.07 points (−1.32 to +1.47) and the definition part −1.54 points (−2.71 to −0.37).</w:t>
+        <w:t xml:space="preserve">In the paired domain, 10.8% (95% CI 9.1 to 12.7) met the HbA1c threshold and 11.2% (9.5 to 13.1) the glucose threshold, a paired difference of −0.41 percentage points (−1.15 to +0.33); adults without a reported diagnosis contributed −1.12 points (−1.69 to −0.56) to that full-population difference (not prespecified). Laboratory-domain HbA1c prevalence differed from paired-domain HbA1c by −0.24 points (−1.44 to +0.96). Agreement was 95.0%, yet 37% of adults above either threshold exceeded only one. Of adults reporting diagnosed diabetes, 20.3% had both biomarkers below threshold. The surveillance composite (15.8%) and its parts reproduced all 18 published national point estimates. In 2017 to March 2020 the sample and weight part was +0.07 points (−1.32 to +1.47) and the definition part −1.54 points (−2.71 to −0.37).</w:t>
       </w:r>
     </w:p>
     <w:p>
@@ -273,7 +259,7 @@
           <w:rFonts w:ascii="Times New Roman" w:hAnsi="Times New Roman"/>
           <w:color w:val="000000"/>
         </w:rPr>
-        <w:t xml:space="preserve">NHANES is the main source of national estimates of undiagnosed diabetes in the United States because it pairs an interview with laboratory measurement [1, 2]. Surveillance definitions combine a self-reported diagnosis with one or both of two biochemical thresholds [1, 2] drawn from clinical criteria: glycated hemoglobin (HbA1c) at or above 6.5% [3–5] and fasting plasma glucose at or above 126 mg/dL [3]. The two tests reflect different aspects of glycemia, and their cut points classify partly different people [3, 4].</w:t>
+        <w:t xml:space="preserve">The National Health and Nutrition Examination Survey (NHANES) is the main source of national estimates of undiagnosed diabetes in the United States because it pairs an interview with laboratory measurement [1, 2]. Surveillance definitions combine a self-reported diagnosis with one or both of two biochemical thresholds [1, 2] drawn from clinical criteria: glycated hemoglobin (HbA1c) at or above 6.5% [3–5] and fasting plasma glucose at or above 126 mg/dL [3]. The two tests reflect different aspects of glycemia, and their cut points classify partly different people [3, 4].</w:t>
       </w:r>
     </w:p>
     <w:p>
@@ -382,7 +368,7 @@
           <w:rFonts w:ascii="Times New Roman" w:hAnsi="Times New Roman"/>
           <w:color w:val="000000"/>
         </w:rPr>
-        <w:t xml:space="preserve">Use of AI tools</w:t>
+        <w:t xml:space="preserve">Use of artificial intelligence (AI) tools</w:t>
       </w:r>
     </w:p>
     <w:p>
@@ -395,7 +381,7 @@
           <w:rFonts w:ascii="Times New Roman" w:hAnsi="Times New Roman"/>
           <w:color w:val="000000"/>
         </w:rPr>
-        <w:t>I designed the study, wrote and reviewed the code, performed and checked the analyses, and reviewed the results, references and manuscript. Claude Code (Anthropic) and ChatGPT (OpenAI) assisted with coding, data analysis, literature searching and manuscript preparation. Codex (OpenAI) assisted with code and result checks, editorial revision and document formatting. I take full responsibility for the work.</w:t>
+        <w:t>I designed the study, wrote and reviewed the code, performed and checked the analyses, and reviewed the results, references and manuscript. Claude Code (Anthropic) and ChatGPT (OpenAI) assisted with coding, data analysis, literature searching and manuscript preparation. Codex (OpenAI) assisted with code and result checks, editorial revision and document formatting. Exact model versions were not recorded. I checked the AI-assisted code, results and references as described under Verification. I take full responsibility for the work.</w:t>
       </w:r>
     </w:p>
     <w:bookmarkEnd w:id="22"/>
@@ -423,7 +409,7 @@
           <w:rFonts w:ascii="Times New Roman" w:hAnsi="Times New Roman"/>
           <w:color w:val="000000"/>
         </w:rPr>
-        <w:t xml:space="preserve">The primary data were the NHANES August 2021 to August 2023 public-use files for demographics (DEMO_L), glycohemoglobin (GHB_L), plasma fasting glucose (GLU_L), the fasting questionnaire (FASTQX_L), the diabetes questionnaire (DIQ_L), and reproductive health (RHQ_L) [14, 16, 17, 21–24]. Files were downloaded on 2026-10-07 by following the links on the official NCHS listing pages, checked against the SAS transport file header, and recorded with SHA-256 checksums that the build recomputes before every run. The release has 15 masked variance strata and 30 masked primary sampling units (PSUs), giving 15 design degrees of freedom. No newer complete release with these components was available on the access date. The NHANES 2017 to March 2020 pre-pandemic files (P_DEMO, P_GHB, P_GLU, P_FASTQX, P_DIQ, P_RHQ; 24 strata, 49 PSUs) were analyzed separately as a replication, with their own weights [25–30]. The two releases were not pooled and no trend was estimated, following NCHS guidance against combining them without care [15].</w:t>
+        <w:t xml:space="preserve">The primary data were the NHANES August 2021 to August 2023 public-use files for demographics (DEMO_L), glycohemoglobin (GHB_L), plasma fasting glucose (GLU_L), the fasting questionnaire (FASTQX_L), the diabetes questionnaire (DIQ_L), and reproductive health (RHQ_L) [14, 16, 17, 21–24]. Files were downloaded on 2026-10-07 by following the links on the official NCHS listing pages, checked against the SAS transport file header, and recorded with Secure Hash Algorithm 256-bit (SHA-256) checksums that the build recomputes before every run. The release has 15 masked variance strata and 30 masked primary sampling units (PSUs), giving 15 design degrees of freedom. No newer complete release with these components was available on the access date. The NHANES 2017 to March 2020 pre-pandemic files (P_DEMO, P_GHB, P_GLU, P_FASTQX, P_DIQ, P_RHQ; 24 strata, 49 PSUs) were analyzed separately as a replication, with their own weights [25–30]. The two releases were not pooled and no trend was estimated, following NCHS guidance to use caution when combining August 2021 to August 2023 data with earlier cycles [15].</w:t>
       </w:r>
     </w:p>
     <w:bookmarkEnd w:id="23"/>
@@ -451,7 +437,7 @@
           <w:rFonts w:ascii="Times New Roman" w:hAnsi="Times New Roman"/>
           <w:color w:val="000000"/>
         </w:rPr>
-        <w:t>The analysis plan was written and frozen, with a recorded SHA-256 hash, before any threshold classification or survey estimate was computed. It fixed the domains, phenotypes, eight configurations, contrasts, sensitivity analyses, suppression rule, and a qualitative description of a useful negative result. Before freezing it, I had read the NCHS documentation, whose codebooks print unweighted frequencies, and the published NCHS estimates for the release.</w:t>
+        <w:t>The analysis plan was written and frozen, with a recorded SHA-256 hash, before any threshold classification or survey estimate was computed. It was an internal, timestamped plan and was not registered with an external registry. It fixed the domains, phenotypes, eight configurations, contrasts, sensitivity analyses, suppression rule, and a qualitative description of a useful negative result. Before freezing it, I had read the NCHS documentation, whose codebooks print unweighted frequencies, and the published NCHS estimates for the release.</w:t>
       </w:r>
     </w:p>
     <w:p>
@@ -492,7 +478,7 @@
           <w:rFonts w:ascii="Times New Roman" w:hAnsi="Times New Roman"/>
           <w:color w:val="000000"/>
         </w:rPr>
-        <w:t xml:space="preserve">Each participant in the demographics file contributed one record to the survey design. Domains were formed by subsetting that design, retaining all PSUs. The adult domain (A) included interviewed and examined participants aged 20 or older with a usable answer to the diagnosis question. Pregnancy was resolved with the examination variable RIDEXPRG (positive test or self-report at the examination), whose public universe is women aged 20 to 44. Participants coded as pregnant were excluded, as were those whose status could not be ascertained at the examination but who reported a current pregnancy at the interview (RHD143). Women whose status could not be ascertained and who did not report a pregnancy were retained and counted. For men and for women outside the 20 to 44 universe the item was recorded as not applicable, not as a negative result. The diagnosis question asks women aged 20 or older about diabetes</w:t>
+        <w:t xml:space="preserve">Each participant in the demographics file contributed one record to the survey design. Domains were formed by subsetting that design, retaining all PSUs. The adult domain (A) included interviewed and examined participants aged 20 or older with a usable answer to the diagnosis question. Pregnancy was resolved with the examination variable RIDEXPRG (positive test or self-report at the examination), whose public universe is women aged 20 to 44. Participants coded as pregnant were excluded, as were those whose status could not be ascertained at the examination but who reported a current pregnancy at the interview (RHD143). Women whose status could not be ascertained and who did not report a pregnancy were retained (27 women in domain A in 2021 to 2023 and 58 in 2017 to March 2020). For men and for women outside the 20 to 44 universe the item was recorded as not applicable, not as a negative result. The diagnosis question asks women aged 20 or older about diabetes</w:t>
       </w:r>
       <w:r>
         <w:rPr>
@@ -858,7 +844,7 @@
           <w:rFonts w:ascii="Times New Roman" w:hAnsi="Times New Roman"/>
           <w:color w:val="000000"/>
         </w:rPr>
-        <w:t>For 25 randomly selected participants in domain P, I looked up the raw HbA1c, glucose, diagnosis, pregnancy, and weight values and applied the written definitions by hand. Every classification agreed with the pipeline. I recomputed the size of domain P and the numerators and denominators of the two primary estimates directly from the raw files with a separate short script. I compared the composite, diagnosed, and undiagnosed estimates with the published NCHS tables, checked every reference against its DOI, PubMed record, or source web page, and read every table and figure against the result files.</w:t>
+        <w:t>For 25 randomly selected participants in domain P, I looked up the raw HbA1c, glucose, diagnosis, pregnancy, and weight values and applied the written definitions by hand. Every classification agreed with the pipeline. I recomputed the size of domain P and the numerators and denominators of the two primary estimates directly from the raw files with a separate short script. I compared the composite, diagnosed, and undiagnosed estimates with the published NCHS tables, checked every reference against its digital object identifier (DOI), PubMed record, or source web page, and read every table and figure against the result files.</w:t>
       </w:r>
     </w:p>
     <w:bookmarkEnd w:id="32"/>
@@ -886,7 +872,7 @@
           <w:rFonts w:ascii="Times New Roman" w:hAnsi="Times New Roman"/>
           <w:color w:val="000000"/>
         </w:rPr>
-        <w:t>Python 3.13.5 with DuckDB 1.5.6 [35] and pandas 3.0.6 read the files, ran the SQL that builds the analytic frame and phenotypes, and produced figures and exports; R 4.5.1 (2025-06-13) with survey 4.5 produced every estimate [31, 32]; documents were rendered with Quarto 1.6.42 (bundled pandoc and typst). Dependencies are pinned (requirements.lock, renv.lock). Aggregate results are provided in Additional file 3. Reporting follows the STROBE statement for cross-sectional studies where it applies (Additional file 4) [36]. A full rerun from cached inputs reproduced every reported table value within an absolute tolerance of 1e-9. Run identifier: 20261007T212439Z.</w:t>
+        <w:t>Python 3.13.5 with DuckDB 1.5.6 [35] and pandas 3.0.6 read the files, ran the Structured Query Language (SQL) queries that build the analytic frame and phenotypes, and produced figures and exports; R 4.5.1 (2025-06-13) with survey 4.5 produced every estimate [31, 32]; documents were rendered with Quarto 1.6.42 (bundled pandoc and typst). Dependencies are pinned (requirements.lock, renv.lock). Aggregate results are provided in Additional file 3. Reporting follows the Strengthening the Reporting of Observational Studies in Epidemiology (STROBE) statement for cross-sectional studies where it applies (Additional file 4) [36]. A full rerun from cached inputs reproduced every reported table value within an absolute tolerance of 1e-9. Run identifier: 20261007T212439Z.</w:t>
       </w:r>
     </w:p>
     <w:bookmarkEnd w:id="33"/>
@@ -929,7 +915,7 @@
           <w:rFonts w:ascii="Times New Roman" w:hAnsi="Times New Roman"/>
           <w:color w:val="000000"/>
         </w:rPr>
-        <w:t xml:space="preserve">Of 11,933 participants in the 2021 to 2023 demographics file, 8,860 were examined and 6,064 were examined adults aged 20 or older. After excluding 41 women who were pregnant at the examination and 1 who reported a pregnancy at the interview, domain A included 6,022 adults (no adult lacked a usable diagnosis answer). Domain H included 5,729 adults; 268 gave no blood and 25 had a positive weight but no HbA1c result. Domain F included 2,940 adults: 2,626 adults in A were not assigned to the fasting subsample, 211 were assigned but gave no blood, and 245 did not meet the fasting criterion. Domain P included 2,938 adults, which equals the sample size NCHS reports for this release [1]; the full participant flow for both releases is in Additional file 1, Table S3. Most of the missing fasting glucose was missing by design: among adults in A (weighted with WTMEC2YR), 43.7% were not assigned to the subsample and 48.9% had a valid glucose value (Figure 1; Additional file 1, Table S4). Non-Hispanic Black adults had a lower estimated share with a valid fasting glucose (41.9%, 95% CI 34.8 to 49.3, versus 48.9% overall), an interval that includes the overall value, and a higher share lacking HbA1c (8.3%, 6.0 to 11.0, versus 4.9%, 4.0 to 5.8).</w:t>
+        <w:t xml:space="preserve">Of 11,933 participants in the 2021 to 2023 demographics file, 8,860 were examined and 6,064 were examined adults aged 20 or older. After excluding 41 women who were pregnant at the examination and 1 who reported a pregnancy at the interview, domain A included 6,022 adults (no adult lacked a usable diagnosis answer). Domain H included 5,729 adults; 268 gave no blood and 25 had a positive weight but no HbA1c result. Domain F included 2,940 adults: 2,626 adults in A were not assigned to the fasting subsample, 211 were assigned but gave no blood, and 245 did not meet the fasting criterion. Domain P included 2,938 adults, which equals the sample size NCHS reports for this release [1]; the full participant flow for both releases is in Additional file 1, Table S3. Most of the missing fasting glucose was missing by design: among adults in A (weighted with WTMEC2YR), 43.7% were not assigned to the subsample and 48.9% had a valid glucose value (Figure 1; Additional file 1, Table S4). Non-Hispanic Black adults had a lower estimated share with a valid fasting glucose (41.9%, 95% confidence interval [CI] 34.8 to 49.3, versus 48.9% overall), an interval that includes the overall value, and a higher share lacking HbA1c (8.3%, 6.0 to 11.0, versus 4.9%, 4.0 to 5.8).</w:t>
       </w:r>
     </w:p>
     <w:bookmarkEnd w:id="35"/>
@@ -957,7 +943,7 @@
           <w:rFonts w:ascii="Times New Roman" w:hAnsi="Times New Roman"/>
           <w:color w:val="000000"/>
         </w:rPr>
-        <w:t xml:space="preserve">In P, 10.8% of adults (95% CI 9.1 to 12.7; 371 of 2,938 unweighted) had HbA1c at or above 6.5% and 11.2% (9.5 to 13.1; 383 of 2,938) had fasting glucose at or above 126 mg/dL (Figure 2, Table 1). The paired difference was −0.41 percentage points (−1.15 to +0.33; p = 0.25; Table 2). The sampling correlation between the two estimates was 0.91, so the paired standard error (0.35 points) was 3.4 times smaller than one that ignored the covariance (1.17 points).</w:t>
+        <w:t xml:space="preserve">In P, 10.8% of adults (95% CI 9.1 to 12.7; 371 of 2,938 unweighted) had HbA1c at or above 6.5% and 11.2% (9.5 to 13.1; 383 of 2,938) had fasting glucose at or above 126 mg/dL (Figure 2, Table 1). The paired difference was −0.41 percentage points (−1.15 to +0.33; p = 0.25; Table 2). The sampling correlation between the two estimates was 0.91, so a standard error that ignored the covariance (1.17 points) would have been 3.4 times the paired standard error (0.35 points).</w:t>
       </w:r>
     </w:p>
     <w:p>
@@ -1283,7 +1269,7 @@
           <w:rFonts w:ascii="Times New Roman" w:hAnsi="Times New Roman"/>
           <w:color w:val="000000"/>
         </w:rPr>
-        <w:t xml:space="preserve">Item nonresponse was not reweighted. It was small in 2021 to 2023 (25 of 5,754 adults with a phlebotomy weight had no HbA1c result), but in 2017 to March 2020 451 of 8,451 adults in A (5.3% unweighted; 4.2% weighted) lacked HbA1c under an examination weight that does not account for it. The unweighted share exceeds the 5% level set in the plan.</w:t>
+        <w:t xml:space="preserve">Item nonresponse was not reweighted. It was small in 2021 to 2023 (25 of 5,754 adults with a phlebotomy weight had no HbA1c result), but in 2017 to March 2020, 451 of 8,451 adults in A (5.3% unweighted; 4.2% weighted) lacked HbA1c under an examination weight that does not account for it. The unweighted share exceeds the 5% level set in the plan.</w:t>
       </w:r>
     </w:p>
     <w:p>
@@ -1455,7 +1441,7 @@
           <w:rFonts w:ascii="Times New Roman" w:hAnsi="Times New Roman"/>
           <w:color w:val="000000"/>
         </w:rPr>
-        <w:t>The datasets analyzed during the current study are publicly available from the National Center for Health Statistics: the NHANES August 2021 to August 2023 files DEMO_L, GHB_L, GLU_L, FASTQX_L, DIQ_L, and RHQ_L and the 2017 to March 2020 pre-pandemic files P_DEMO, P_GHB, P_GLU, P_FASTQX, P_DIQ, and P_RHQ, at https://wwwn.cdc.gov/nchs/nhanes/ [16, 17, 21–30, 45]. Their use is subject to the NCHS data user agreement, which permits use for statistical reporting and analysis only and prohibits any attempt to identify participants. Participant-level files are not redistributed with this article. Additional file 2 contains the source manifest, with the download address and SHA-256 checksum of every file, and the code, SQL, configuration, phenotype specification, and analysis plan; its documented commands download the files from the NCHS pages, verify the checksums, and reproduce every reported estimate. The code and configuration checker are provided under the MIT license. Aggregate results are provided in Additional files 2 and 3.</w:t>
+        <w:t>The datasets analyzed during the current study are publicly available from the National Center for Health Statistics: the NHANES August 2021 to August 2023 files DEMO_L, GHB_L, GLU_L, FASTQX_L, DIQ_L, and RHQ_L and the 2017 to March 2020 pre-pandemic files P_DEMO, P_GHB, P_GLU, P_FASTQX, P_DIQ, and P_RHQ, at https://wwwn.cdc.gov/nchs/nhanes/ [16, 17, 21–30, 45]. Their use is subject to the NCHS data user agreement, which permits use for statistical reporting and analysis only and prohibits any attempt to identify participants. Participant-level files are not redistributed with this article. Additional file 2 contains the source manifest, with the download address and SHA-256 checksum of every file, and the code, SQL, configuration, phenotype specification, and analysis plan; its documented commands download the files from the NCHS pages, verify the checksums, and reproduce every reported estimate. The code and configuration checker are provided under the MIT license. Aggregate results are provided in Additional files 2 and 3. The code is also available at https://anibose11.github.io/projects/diabetes-definition-audit/ [46]. An archived copy of the code (version 1.0.0) is available in the Zenodo repository, https://doi.org/10.5281/zenodo.23450169 [47].</w:t>
       </w:r>
     </w:p>
     <w:p>
@@ -1484,7 +1470,7 @@
           <w:rFonts w:ascii="Times New Roman" w:hAnsi="Times New Roman"/>
           <w:color w:val="000000"/>
         </w:rPr>
-        <w:t>I own Norlowe Research and declare no other competing interests.</w:t>
+        <w:t>Animesh Bose owns Norlowe Research and has no other competing interests.</w:t>
       </w:r>
     </w:p>
     <w:p>
@@ -1542,7 +1528,7 @@
           <w:rFonts w:ascii="Times New Roman" w:hAnsi="Times New Roman"/>
           <w:color w:val="000000"/>
         </w:rPr>
-        <w:t>Animesh Bose is the sole author. Contributions (CRediT): conceptualization, methodology, software, validation, formal analysis, investigation, data curation, resources, writing – original draft, writing – review and editing, visualization, and project administration. Animesh Bose read and approved the final manuscript.</w:t>
+        <w:t>Animesh Bose is the sole author and was responsible for conceptualization, methodology, software, validation, formal analysis, investigation, data curation, resources, writing (original draft, review and editing), visualization and project administration (CRediT roles), and read and approved the final manuscript.</w:t>
       </w:r>
     </w:p>
     <w:p>
@@ -1571,7 +1557,7 @@
           <w:rFonts w:ascii="Times New Roman" w:hAnsi="Times New Roman"/>
           <w:color w:val="000000"/>
         </w:rPr>
-        <w:t>I thank the NHANES participants and the National Center for Health Statistics for collecting and releasing the data.</w:t>
+        <w:t>I thank the NHANES participants for taking part, and the National Center for Health Statistics for collecting and releasing the data.</w:t>
       </w:r>
     </w:p>
     <w:bookmarkEnd w:id="47"/>
@@ -1642,7 +1628,7 @@
           <w:rFonts w:ascii="Times New Roman" w:hAnsi="Times New Roman"/>
           <w:color w:val="000000"/>
         </w:rPr>
-        <w:t xml:space="preserve">Centers for Disease Control and Prevention. National Diabetes Statistics Report. Updated 11 March 2026.</w:t>
+        <w:t xml:space="preserve">Centers for Disease Control and Prevention. National Diabetes Statistics Report. Updated 11 Mar 2026.</w:t>
       </w:r>
       <w:r>
         <w:rPr>
@@ -2088,7 +2074,7 @@
           <w:rFonts w:ascii="Times New Roman" w:hAnsi="Times New Roman"/>
           <w:color w:val="000000"/>
         </w:rPr>
-        <w:t xml:space="preserve">National Center for Health Statistics. NHANES weighting tutorial.</w:t>
+        <w:t xml:space="preserve">National Center for Health Statistics. NHANES tutorials: weighting module.</w:t>
       </w:r>
       <w:r>
         <w:rPr>
@@ -3175,7 +3161,7 @@
           <w:rFonts w:ascii="Times New Roman" w:hAnsi="Times New Roman"/>
           <w:color w:val="000000"/>
         </w:rPr>
-        <w:t xml:space="preserve">National Center for Health Statistics. NHANES 2017–March 2020 brochures and consent documents.</w:t>
+        <w:t xml:space="preserve">National Center for Health Statistics. NHANES 2017–March 2020 pre-pandemic brochures and consent documents.</w:t>
       </w:r>
       <w:r>
         <w:rPr>
@@ -3276,6 +3262,84 @@
           <w:color w:val="000000"/>
         </w:rPr>
         <w:t xml:space="preserve">. Accessed 7 Oct 2026.</w:t>
+      </w:r>
+    </w:p>
+    <w:p>
+      <w:pPr>
+        <w:pStyle w:val="Compact"/>
+        <w:numPr>
+          <w:ilvl w:val="0"/>
+          <w:numId w:val="1001"/>
+        </w:numPr>
+        <w:spacing w:line="480" w:lineRule="auto"/>
+      </w:pPr>
+      <w:r>
+        <w:rPr>
+          <w:rFonts w:ascii="Times New Roman" w:hAnsi="Times New Roman"/>
+          <w:color w:val="000000"/>
+        </w:rPr>
+        <w:t xml:space="preserve">Bose A. Diabetes estimates under different definitions and laboratory denominators. 2026.</w:t>
+      </w:r>
+      <w:r>
+        <w:rPr>
+          <w:rFonts w:ascii="Times New Roman" w:hAnsi="Times New Roman"/>
+          <w:color w:val="000000"/>
+        </w:rPr>
+        <w:t xml:space="preserve"> </w:t>
+      </w:r>
+      <w:hyperlink r:id="rId90">
+        <w:r>
+          <w:rPr>
+            <w:rStyle w:val="Hyperlink"/>
+          </w:rPr>
+          <w:t xml:space="preserve">https://anibose11.github.io/projects/diabetes-definition-audit/</w:t>
+        </w:r>
+      </w:hyperlink>
+      <w:r>
+        <w:rPr>
+          <w:rFonts w:ascii="Times New Roman" w:hAnsi="Times New Roman"/>
+          <w:color w:val="000000"/>
+        </w:rPr>
+        <w:t xml:space="preserve">. Accessed 18 Oct 2026.</w:t>
+      </w:r>
+    </w:p>
+    <w:p>
+      <w:pPr>
+        <w:pStyle w:val="Compact"/>
+        <w:numPr>
+          <w:ilvl w:val="0"/>
+          <w:numId w:val="1001"/>
+        </w:numPr>
+        <w:spacing w:line="480" w:lineRule="auto"/>
+      </w:pPr>
+      <w:r>
+        <w:rPr>
+          <w:rFonts w:ascii="Times New Roman" w:hAnsi="Times New Roman"/>
+          <w:color w:val="000000"/>
+        </w:rPr>
+        <w:t xml:space="preserve">Bose A. Diabetes definition audit: NHANES phenotype, denominator, and weight checks. Version 1.0.0. Zenodo. 2026.</w:t>
+      </w:r>
+      <w:r>
+        <w:rPr>
+          <w:rFonts w:ascii="Times New Roman" w:hAnsi="Times New Roman"/>
+          <w:color w:val="000000"/>
+        </w:rPr>
+        <w:t xml:space="preserve"> </w:t>
+      </w:r>
+      <w:hyperlink r:id="rId91">
+        <w:r>
+          <w:rPr>
+            <w:rStyle w:val="Hyperlink"/>
+          </w:rPr>
+          <w:t xml:space="preserve">https://doi.org/10.5281/zenodo.23450169</w:t>
+        </w:r>
+      </w:hyperlink>
+      <w:r>
+        <w:rPr>
+          <w:rFonts w:ascii="Times New Roman" w:hAnsi="Times New Roman"/>
+          <w:color w:val="000000"/>
+        </w:rPr>
+        <w:t xml:space="preserve">.</w:t>
       </w:r>
     </w:p>
     <w:bookmarkEnd w:id="90"/>
@@ -12595,7 +12659,7 @@
           <w:rFonts w:ascii="Times New Roman" w:hAnsi="Times New Roman"/>
           <w:color w:val="000000"/>
         </w:rPr>
-        <w:t xml:space="preserve">Domain A, August 2021 to August 2023 (n = 6,022), weighted with the examination weight WTMEC2YR. Each bar splits adults into those with a valid fasting glucose, those not assigned to the fasting subsample, those assigned without a blood specimen, and those assigned with a fast outside 8 to less than 24 hours. Hatched segments are suppressed under the NCHS presentation standards and are not interpreted. Cell estimates are in Additional file 1, Table S4.</w:t>
+        <w:t xml:space="preserve">Domain A, August 2021 to August 2023 (n = 6,022), weighted with the examination weight WTMEC2YR. Each bar splits adults into those with a valid fasting glucose, those not assigned to the fasting subsample, those assigned without a blood specimen, and those assigned with a fast outside 8 to less than 24 hours. Hatched segments are suppressed under the NCHS presentation standards and are not interpreted. Cell estimates are in Additional file 1, Table S4. Plotted with AI-assisted study code, checked by the author.</w:t>
       </w:r>
     </w:p>
     <w:p>
@@ -12624,7 +12688,7 @@
           <w:rFonts w:ascii="Times New Roman" w:hAnsi="Times New Roman"/>
           <w:color w:val="000000"/>
         </w:rPr>
-        <w:t xml:space="preserve">Domain P: n = 2,938 (August 2021 to August 2023, WTSAF2YR) and 3,757 (2017 to March 2020, WTSAFPRP). Left, weighted prevalence of HbA1c at or above 6.5% and fasting glucose at or above 126 mg/dL with 95% Korn-Graubard intervals. Right, paired difference (HbA1c minus glucose) with 95% t intervals using design degrees of freedom.</w:t>
+        <w:t xml:space="preserve">Domain P: n = 2,938 (August 2021 to August 2023, WTSAF2YR) and 3,757 (2017 to March 2020, WTSAFPRP). Left, weighted prevalence of HbA1c at or above 6.5% and fasting glucose at or above 126 mg/dL with 95% Korn-Graubard intervals. Right, paired difference (HbA1c minus glucose) with 95% t intervals using design degrees of freedom. Plotted with AI-assisted study code, checked by the author.</w:t>
       </w:r>
     </w:p>
     <w:p>
@@ -12653,7 +12717,7 @@
           <w:rFonts w:ascii="Times New Roman" w:hAnsi="Times New Roman"/>
           <w:color w:val="000000"/>
         </w:rPr>
-        <w:t xml:space="preserve">Left, HbA1c at or above 6.5% in domain H (WTPH2YR, n = 5,729, in 2021 to 2023; WTMECPRP, n = 8,000, in 2017 to March 2020) and in domain P (fasting subsample weight). Right, the naive difference (HbA1c in H minus glucose in P) equals the definition part (both in P) plus the sample and weight part (HbA1c in H minus HbA1c in P). The sample and weight part is a descriptive comparison. Lines are 95% intervals.</w:t>
+        <w:t xml:space="preserve">Left, HbA1c at or above 6.5% in domain H (WTPH2YR, n = 5,729, in 2021 to 2023; WTMECPRP, n = 8,000, in 2017 to March 2020) and in domain P (fasting subsample weight). Right, the naive difference (HbA1c in H minus glucose in P) equals the definition part (both in P) plus the sample and weight part (HbA1c in H minus HbA1c in P). The sample and weight part is a descriptive comparison. Lines are 95% intervals. Plotted with AI-assisted study code, checked by the author.</w:t>
       </w:r>
     </w:p>
     <w:p>
@@ -12682,7 +12746,7 @@
           <w:rFonts w:ascii="Times New Roman" w:hAnsi="Times New Roman"/>
           <w:color w:val="000000"/>
         </w:rPr>
-        <w:t xml:space="preserve">August 2021 to August 2023, n = 2,938, WTSAF2YR. Bars are weighted shares of all adults in domain P with 95% Korn-Graubard intervals and unweighted counts. Adults with no diagnosis and both values below threshold (84.2%) are not drawn.</w:t>
+        <w:t xml:space="preserve">August 2021 to August 2023, n = 2,938, WTSAF2YR. Bars are weighted shares of all adults in domain P with 95% Korn-Graubard intervals and unweighted counts. Adults with no diagnosis and both values below threshold (84.2%) are not drawn. Plotted with AI-assisted study code, checked by the author.</w:t>
       </w:r>
     </w:p>
     <w:p>
@@ -12711,7 +12775,7 @@
           <w:rFonts w:ascii="Times New Roman" w:hAnsi="Times New Roman"/>
           <w:color w:val="000000"/>
         </w:rPr>
-        <w:t xml:space="preserve">S1, narrow fasting rule (P-narrow, n = 2,766) compared with domain P; S2, single-biomarker domains H and F; S3, diagnosis, biochemical-only, and composite definitions in domain P. Weighted prevalence with 95% Korn-Graubard intervals.</w:t>
+        <w:t xml:space="preserve">S1, narrow fasting rule (P-narrow, n = 2,766) compared with domain P; S2, single-biomarker domains H and F; S3, diagnosis, biochemical-only, and composite definitions in domain P. Weighted prevalence with 95% Korn-Graubard intervals. Plotted with AI-assisted study code, checked by the author.</w:t>
       </w:r>
     </w:p>
     <w:bookmarkEnd w:id="92"/>

</xml_diff>

<commit_message>
Update the project pages and reports with the corrected and extended analyses
</commit_message>
<xml_diff>
--- a/projects/diabetes-definition-audit/downloads/manuscript.docx
+++ b/projects/diabetes-definition-audit/downloads/manuscript.docx
@@ -381,7 +381,7 @@
           <w:rFonts w:ascii="Times New Roman" w:hAnsi="Times New Roman"/>
           <w:color w:val="000000"/>
         </w:rPr>
-        <w:t>I designed the study, wrote and reviewed the code, performed and checked the analyses, and reviewed the results, references and manuscript. Claude Code (Anthropic) and ChatGPT (OpenAI) assisted with coding, data analysis, literature searching and manuscript preparation. Codex (OpenAI) assisted with code and result checks, editorial revision and document formatting. Exact model versions were not recorded. I checked the AI-assisted code, results and references as described under Verification. I take full responsibility for the work.</w:t>
+        <w:t>Animesh Bose conceived and designed the study, developed the methodology, explored the data, and reviewed and verified the analyses and text. AI coding and writing assistants helped write code, run analyses and draft text under the author’s direction. Claude Code (Anthropic) and ChatGPT (OpenAI) assisted with coding, data analysis, literature searching and manuscript preparation. Codex (OpenAI) assisted with editorial revision and document formatting. Exact model versions were not recorded; the author recalls models from the GPT-5 and GPT-6 families in ChatGPT and Codex. The checks of the code, results and references were automated or run by these AI tools and are described under Verification. Animesh Bose takes full responsibility for the work.</w:t>
       </w:r>
     </w:p>
     <w:bookmarkEnd w:id="22"/>
@@ -437,7 +437,7 @@
           <w:rFonts w:ascii="Times New Roman" w:hAnsi="Times New Roman"/>
           <w:color w:val="000000"/>
         </w:rPr>
-        <w:t>The analysis plan was written and frozen, with a recorded SHA-256 hash, before any threshold classification or survey estimate was computed. It was an internal, timestamped plan and was not registered with an external registry. It fixed the domains, phenotypes, eight configurations, contrasts, sensitivity analyses, suppression rule, and a qualitative description of a useful negative result. Before freezing it, I had read the NCHS documentation, whose codebooks print unweighted frequencies, and the published NCHS estimates for the release.</w:t>
+        <w:t>The analysis plan was written and frozen, with a recorded SHA-256 hash, before any threshold classification or survey estimate was computed. It was an internally time-stamped plan and was not registered with an external registry. It fixed the domains, phenotypes, eight configurations, contrasts, sensitivity analyses, suppression rule, and a qualitative description of a useful negative result. The plan records what had been read before it was frozen: the NCHS documentation, whose codebooks print unweighted frequencies, and the published NCHS estimates for the release.</w:t>
       </w:r>
     </w:p>
     <w:p>
@@ -450,7 +450,7 @@
           <w:rFonts w:ascii="Times New Roman" w:hAnsi="Times New Roman"/>
           <w:color w:val="000000"/>
         </w:rPr>
-        <w:t xml:space="preserve">Additional file 1 records eight dated amendments. They cover two narrow-domain contrasts already described under sensitivity analysis 1, a per-release mapping of weight variables needed for the replication, the details of the NCHS reconciliation and of the interval method, three reporting notes (suppressed group components, a treatment-unknown row, and item nonresponse above 5% reported as a limitation), a note that the prior-work log and the contribution statement were finalized after the first estimation run, and three analyses that were not prespecified (described below). None changed a phenotype definition, threshold, domain, 2021 to 2023 weight, or one of the eight configurations.</w:t>
+        <w:t>Additional file 1 lists eight amendments. All were written on 7 October 2026, after the plan was frozen and after the first estimation run, and they are recorded together under that date rather than with individual times. They cover two narrow-domain contrasts already described under sensitivity analysis 1, a per-release mapping of weight variables needed for the replication, the details of the NCHS reconciliation and of the interval method, three reporting notes (suppressed group components, a treatment-unknown row, and item nonresponse above 5% reported as a limitation), a note that the prior-work log and the contribution statement were written after the first estimation run, and three analyses that were not prespecified (described below). None changed a phenotype definition, threshold, domain, 2021 to 2023 weight, or one of the eight configurations.</w:t>
       </w:r>
     </w:p>
     <w:bookmarkEnd w:id="24"/>
@@ -818,7 +818,7 @@
           <w:rFonts w:ascii="Times New Roman" w:hAnsi="Times New Roman"/>
           <w:color w:val="000000"/>
         </w:rPr>
-        <w:t xml:space="preserve">Three kinds of automated checks were kept apart. Software checks confirmed join cardinality and that domains nested as declared. Python code written separately from the R estimation reproduced every reported point estimate from direct weighted sums, and an independent Python implementation of the linearized variance reproduced the R standard errors of every proportion and contrast and the covariance of the two primary estimates; the delta-method standard errors of kappa and the agreement ratios were not recomputed. Source reconciliation compared counts in the data files with the frequencies printed in the NCHS codebooks (91 codebook rows for 2021 to 2023 and 85 for 2017 to March 2020). External reconciliation compared estimates with NCHS Data Brief 516, which used the same age range and thresholds, excluded pregnant women, and used fasting sample weights [1]; sample sizes matched in all 18 published rows. All 39 automated checks passed (Additional file 1, Table S2). These checks test the software and its agreement with official sources; they are not independent expert review of the conclusions.</w:t>
+        <w:t>Three kinds of automated checks were kept apart. Software checks confirmed join cardinality and that domains nested as declared. A second implementation in Python (src/ddaudit/direct.py), part of the same AI-assisted code base as the R estimation, reproduced every reported point estimate from direct weighted sums, and its own linearized variance reproduced the R standard errors of every proportion and contrast and the covariance of the two primary estimates (largest relative difference in a standard error 1.8e-12); the delta-method standard errors of kappa and the agreement ratios were not recomputed. Source reconciliation compared counts in the data files with the frequencies printed in the NCHS codebooks (91 codebook rows for 2021 to 2023 and 85 for 2017 to March 2020). External reconciliation compared estimates with NCHS Data Brief 516, which used the same age range and thresholds, excluded pregnant women, and used fasting sample weights [1]; sample sizes matched in all 18 published rows. All 39 automated checks passed (Additional file 1, Table S2). These checks test the software and its agreement with official sources; they are not expert review of the conclusions.</w:t>
       </w:r>
     </w:p>
     <w:p>
@@ -831,7 +831,7 @@
           <w:rFonts w:ascii="Times New Roman" w:hAnsi="Times New Roman"/>
           <w:color w:val="000000"/>
         </w:rPr>
-        <w:t>I repeated key steps by hand, outside the pipeline. After downloading the six 2021 to 2023 component files again from the NCHS listing pages, I confirmed that their SHA-256 checksums matched the source manifest and compared each variable name, response code, universe, and weight instruction in the phenotype specification and data dictionary with the NCHS documentation pages. I reran the full pipeline on my computer from a clean extraction of the source archive, and the rerun outputs matched the reported results within the declared tolerance.</w:t>
+        <w:t>Further checks outside the pipeline were run on 7 October 2026 by a recheck script written with Claude Code that does not use the analysis package (scripts/independent_recheck.py in Additional file 2). It downloaded the twelve component files of both releases again from the NCHS data-file addresses into an empty folder, found that all 12 SHA-256 checksums matched the source manifest, and confirmed that the variable names, response-code labels and weight names used in the phenotype specification appear on the current documentation pages of the six 2021 to 2023 files. In addition, an automated packaging check (scripts/verify_bundle.py) extracted the source archive into a clean folder, supplied the cached NCHS files, ran the documented setup, tests and full pipeline, and reproduced all 11,494 table values in 46 files (largest absolute difference 0; tolerance 1e-9).</w:t>
       </w:r>
     </w:p>
     <w:p>
@@ -844,7 +844,7 @@
           <w:rFonts w:ascii="Times New Roman" w:hAnsi="Times New Roman"/>
           <w:color w:val="000000"/>
         </w:rPr>
-        <w:t>For 25 randomly selected participants in domain P, I looked up the raw HbA1c, glucose, diagnosis, pregnancy, and weight values and applied the written definitions by hand. Every classification agreed with the pipeline. I recomputed the size of domain P and the numerators and denominators of the two primary estimates directly from the raw files with a separate short script. I compared the composite, diagnosed, and undiagnosed estimates with the published NCHS tables, checked every reference against its digital object identifier (DOI), PubMed record, or source web page, and read every table and figure against the result files.</w:t>
+        <w:t>For 25 participants drawn at random from domain P (seed 20261007), the script compared the raw HbA1c, glucose and fasting-weight values in the newly downloaded files with the values the pipeline used, and re-applied the written definitions of diagnosis, the two thresholds and domain P. Every classification agreed with the pipeline. The same script rebuilt domains P and H from the raw files with pandas and recomputed, for both releases, the three headline estimates (HbA1c and glucose in P, HbA1c in H), their linearized standard errors and the two contrasts; counts matched exactly, and the largest difference from the pipeline across 28 quantities was 5.3e-16. Claude Code also compared the composite, diagnosed and undiagnosed estimates with the tables of NCHS Data Brief 516 (all 18 rows matched) and resolved the DOI or web address of each of references 1 to 45 through Crossref, the DOI handle service or a direct request, comparing title, first author, year, volume and pages with the citation.</w:t>
       </w:r>
     </w:p>
     <w:bookmarkEnd w:id="32"/>
@@ -1164,7 +1164,7 @@
           <w:rFonts w:ascii="Times New Roman" w:hAnsi="Times New Roman"/>
           <w:color w:val="000000"/>
         </w:rPr>
-        <w:t xml:space="preserve">In both releases the estimated sample and weight part was small: −0.24 points (−1.44 to +0.96) in 2021 to 2023 and +0.07 points (−1.32 to +1.47) in 2017 to March 2020. Both intervals include zero and also allow shifts of up to about 1.5 points, so the data exclude only differences larger than about 1.5 points rather than show that there is none. The plan described this outcome in advance, without a numerical margin, as a useful negative result. In 2017 to March 2020 the point estimates place most of the naive cross-domain difference in the definition part, although the sample and weight interval allows a part nearly as large; in 2021 to 2023 neither part could be distinguished from zero. The definition part was larger in 2017 to March 2020 than in 2021 to 2023. The releases were not compared formally, and the difference may reflect sampling error, the HbA1c instrument change, or lower response, so no trend is implied. Similar totals still concealed disagreement about individuals: an estimated 37% (95% CI 31 to 43) of adults above either threshold were above only one.</w:t>
+        <w:t>In both releases the estimated sample and weight part was small: −0.24 points (−1.44 to +0.96) in 2021 to 2023 and +0.07 points (−1.32 to +1.47) in 2017 to March 2020. Both intervals include zero and also allow shifts of up to about 1.5 points, so the data exclude only differences larger than about 1.5 points rather than show that there is none. The plan described this outcome in advance, without a numerical margin, as a useful negative result. In 2017 to March 2020 the point estimates place most of the naive cross-domain difference in the definition part, although the sample and weight interval allows a part nearly as large; in 2021 to 2023 neither part could be distinguished from zero. The definition part was larger in 2017 to March 2020 than in 2021 to 2023. The releases were not compared formally, and the difference may reflect sampling error or the lower response in 2021 to 2023, so no trend is implied. The HbA1c instrument change does not explain it: Tosoh G8 values averaged 2.3% higher than those of the Bio-Rad D-100 that replaced it during 2021 to 2023 [16], so specimens measured on the newer instrument would, if anything, have lowered HbA1c-defined prevalence and made the 2021 to 2023 difference more negative. Similar totals still concealed disagreement about individuals: an estimated 37% (95% CI 31 to 43) of adults above either threshold were above only one.</w:t>
       </w:r>
     </w:p>
     <w:p>
@@ -1470,7 +1470,7 @@
           <w:rFonts w:ascii="Times New Roman" w:hAnsi="Times New Roman"/>
           <w:color w:val="000000"/>
         </w:rPr>
-        <w:t>Animesh Bose owns Norlowe Research and has no other competing interests.</w:t>
+        <w:t>The author declares no competing interests.</w:t>
       </w:r>
     </w:p>
     <w:p>
@@ -1499,7 +1499,7 @@
           <w:rFonts w:ascii="Times New Roman" w:hAnsi="Times New Roman"/>
           <w:color w:val="000000"/>
         </w:rPr>
-        <w:t>This research received no specific grant from any funding agency in the public, commercial, or not-for-profit sectors. I used internal resources from Norlowe Research, which I own.</w:t>
+        <w:t>This research received no specific grant from any funding agency in the public, commercial, or not-for-profit sectors.</w:t>
       </w:r>
     </w:p>
     <w:p>
@@ -1528,7 +1528,7 @@
           <w:rFonts w:ascii="Times New Roman" w:hAnsi="Times New Roman"/>
           <w:color w:val="000000"/>
         </w:rPr>
-        <w:t>Animesh Bose is the sole author and was responsible for conceptualization, methodology, software, validation, formal analysis, investigation, data curation, resources, writing (original draft, review and editing), visualization and project administration (CRediT roles), and read and approved the final manuscript.</w:t>
+        <w:t>Animesh Bose is the sole author. Animesh Bose conceived and designed the study, developed the methodology, explored the data, and reviewed and verified the analyses and text (CRediT: conceptualization, methodology, software, validation, formal analysis, investigation, data curation, resources, writing – original draft, writing – review and editing, visualization, project administration). AI coding and writing assistants, named under “Use of artificial intelligence (AI) tools”, helped write code, run analyses and draft text under the author’s direction.</w:t>
       </w:r>
     </w:p>
     <w:p>
@@ -12659,7 +12659,7 @@
           <w:rFonts w:ascii="Times New Roman" w:hAnsi="Times New Roman"/>
           <w:color w:val="000000"/>
         </w:rPr>
-        <w:t xml:space="preserve">Domain A, August 2021 to August 2023 (n = 6,022), weighted with the examination weight WTMEC2YR. Each bar splits adults into those with a valid fasting glucose, those not assigned to the fasting subsample, those assigned without a blood specimen, and those assigned with a fast outside 8 to less than 24 hours. Hatched segments are suppressed under the NCHS presentation standards and are not interpreted. Cell estimates are in Additional file 1, Table S4. Plotted with AI-assisted study code, checked by the author.</w:t>
+        <w:t>Domain A, August 2021 to August 2023 (n = 6,022), weighted with the examination weight WTMEC2YR. Each bar splits adults into those with a valid fasting glucose, those not assigned to the fasting subsample, those assigned without a blood specimen, and those assigned with a fast outside 8 to less than 24 hours. Hatched segments are suppressed under the NCHS presentation standards and are not interpreted. Cell estimates are in Additional file 1, Table S4.</w:t>
       </w:r>
     </w:p>
     <w:p>
@@ -12688,7 +12688,7 @@
           <w:rFonts w:ascii="Times New Roman" w:hAnsi="Times New Roman"/>
           <w:color w:val="000000"/>
         </w:rPr>
-        <w:t xml:space="preserve">Domain P: n = 2,938 (August 2021 to August 2023, WTSAF2YR) and 3,757 (2017 to March 2020, WTSAFPRP). Left, weighted prevalence of HbA1c at or above 6.5% and fasting glucose at or above 126 mg/dL with 95% Korn-Graubard intervals. Right, paired difference (HbA1c minus glucose) with 95% t intervals using design degrees of freedom. Plotted with AI-assisted study code, checked by the author.</w:t>
+        <w:t>Domain P: n = 2,938 (August 2021 to August 2023, WTSAF2YR) and 3,757 (2017 to March 2020, WTSAFPRP). Left, weighted prevalence of HbA1c at or above 6.5% and fasting glucose at or above 126 mg/dL with 95% Korn-Graubard intervals. Right, paired difference (HbA1c minus glucose) with 95% t intervals using design degrees of freedom.</w:t>
       </w:r>
     </w:p>
     <w:p>
@@ -12717,7 +12717,7 @@
           <w:rFonts w:ascii="Times New Roman" w:hAnsi="Times New Roman"/>
           <w:color w:val="000000"/>
         </w:rPr>
-        <w:t xml:space="preserve">Left, HbA1c at or above 6.5% in domain H (WTPH2YR, n = 5,729, in 2021 to 2023; WTMECPRP, n = 8,000, in 2017 to March 2020) and in domain P (fasting subsample weight). Right, the naive difference (HbA1c in H minus glucose in P) equals the definition part (both in P) plus the sample and weight part (HbA1c in H minus HbA1c in P). The sample and weight part is a descriptive comparison. Lines are 95% intervals. Plotted with AI-assisted study code, checked by the author.</w:t>
+        <w:t>Left, HbA1c at or above 6.5% in domain H (WTPH2YR, n = 5,729, in 2021 to 2023; WTMECPRP, n = 8,000, in 2017 to March 2020) and in domain P (fasting subsample weight). Right, the naive difference (HbA1c in H minus glucose in P) equals the definition part (both in P) plus the sample and weight part (HbA1c in H minus HbA1c in P). The sample and weight part is a descriptive comparison. Lines are 95% intervals.</w:t>
       </w:r>
     </w:p>
     <w:p>
@@ -12746,7 +12746,7 @@
           <w:rFonts w:ascii="Times New Roman" w:hAnsi="Times New Roman"/>
           <w:color w:val="000000"/>
         </w:rPr>
-        <w:t xml:space="preserve">August 2021 to August 2023, n = 2,938, WTSAF2YR. Bars are weighted shares of all adults in domain P with 95% Korn-Graubard intervals and unweighted counts. Adults with no diagnosis and both values below threshold (84.2%) are not drawn. Plotted with AI-assisted study code, checked by the author.</w:t>
+        <w:t>August 2021 to August 2023, n = 2,938, WTSAF2YR. Bars are weighted shares of all adults in domain P with 95% Korn-Graubard intervals and unweighted counts. Adults with no diagnosis and both values below threshold (84.2%) are not drawn.</w:t>
       </w:r>
     </w:p>
     <w:p>
@@ -12775,7 +12775,7 @@
           <w:rFonts w:ascii="Times New Roman" w:hAnsi="Times New Roman"/>
           <w:color w:val="000000"/>
         </w:rPr>
-        <w:t xml:space="preserve">S1, narrow fasting rule (P-narrow, n = 2,766) compared with domain P; S2, single-biomarker domains H and F; S3, diagnosis, biochemical-only, and composite definitions in domain P. Weighted prevalence with 95% Korn-Graubard intervals. Plotted with AI-assisted study code, checked by the author.</w:t>
+        <w:t>S1, narrow fasting rule (P-narrow, n = 2,766) compared with domain P; S2, single-biomarker domains H and F; S3, diagnosis, biochemical-only, and composite definitions in domain P. Weighted prevalence with 95% Korn-Graubard intervals.</w:t>
       </w:r>
     </w:p>
     <w:bookmarkEnd w:id="92"/>
@@ -12849,7 +12849,7 @@
           <w:rFonts w:ascii="Times New Roman" w:hAnsi="Times New Roman"/>
           <w:color w:val="000000"/>
         </w:rPr>
-        <w:t xml:space="preserve">Tables S1 to S7, Figure S1, and the eight dated amendments to the analysis plan.</w:t>
+        <w:t>Tables S1 to S7, Figure S1, and the eight amendments to the analysis plan, all written on 7 October 2026.</w:t>
       </w:r>
     </w:p>
     <w:p>

</xml_diff>

<commit_message>
Update the portfolio wording and the project reports
</commit_message>
<xml_diff>
--- a/projects/diabetes-definition-audit/downloads/manuscript.docx
+++ b/projects/diabetes-definition-audit/downloads/manuscript.docx
@@ -381,7 +381,7 @@
           <w:rFonts w:ascii="Times New Roman" w:hAnsi="Times New Roman"/>
           <w:color w:val="000000"/>
         </w:rPr>
-        <w:t>Animesh Bose conceived and designed the study, developed the methodology, explored the data, and reviewed and verified the analyses and text. AI coding and writing assistants helped write code, run analyses and draft text under the author’s direction. Claude Code (Anthropic) and ChatGPT (OpenAI) assisted with coding, data analysis, literature searching and manuscript preparation. Codex (OpenAI) assisted with editorial revision and document formatting. Exact model versions were not recorded; the author recalls models from the GPT-5 and GPT-6 families in ChatGPT and Codex. The checks of the code, results and references were automated or run by these AI tools and are described under Verification. Animesh Bose takes full responsibility for the work.</w:t>
+        <w:t>Animesh Bose conceived and designed the study, developed the methodology, explored the data, and reviewed and verified the analyses and text. AI coding and writing assistants helped write code, run analyses and draft text under the author’s direction. Claude Code (Anthropic) and ChatGPT (OpenAI) assisted with coding, data analysis, literature searching and manuscript preparation. Codex (OpenAI) assisted with editorial revision and document formatting. Exact model versions were not recorded, except that the Claude Code session logs from 16 October 2026 record Claude Opus 5.5 (claude-opus-5-5); the author recalls models from the GPT-5 and GPT-6 families in ChatGPT and Codex. The checks of the code, results and references were automated or run by these AI tools and are described under Verification. Animesh Bose takes full responsibility for the work.</w:t>
       </w:r>
     </w:p>
     <w:bookmarkEnd w:id="22"/>
@@ -831,7 +831,7 @@
           <w:rFonts w:ascii="Times New Roman" w:hAnsi="Times New Roman"/>
           <w:color w:val="000000"/>
         </w:rPr>
-        <w:t>Further checks outside the pipeline were run on 7 October 2026 by a recheck script written with Claude Code that does not use the analysis package (scripts/independent_recheck.py in Additional file 2). It downloaded the twelve component files of both releases again from the NCHS data-file addresses into an empty folder, found that all 12 SHA-256 checksums matched the source manifest, and confirmed that the variable names, response-code labels and weight names used in the phenotype specification appear on the current documentation pages of the six 2021 to 2023 files. In addition, an automated packaging check (scripts/verify_bundle.py) extracted the source archive into a clean folder, supplied the cached NCHS files, ran the documented setup, tests and full pipeline, and reproduced all 11,494 table values in 46 files (largest absolute difference 0; tolerance 1e-9).</w:t>
+        <w:t>Further checks outside the pipeline were run on 7 October 2026 by a recheck script written with Claude Code that does not use the analysis package (scripts/independent_recheck.py in Additional file 2). It downloaded the 12 component files of both releases again from the NCHS data-file addresses into an empty folder, found that all 12 SHA-256 checksums matched the source manifest, and confirmed that the variable names, response-code labels and weight names used in the phenotype specification appear on the current documentation pages of the six 2021 to 2023 files. In addition, an automated packaging check (scripts/verify_bundle.py) extracted the source archive, as packaged that day, into a clean folder, supplied the cached NCHS files, ran the documented setup, tests and full pipeline, and reproduced all 11,494 table values in 46 files (largest absolute difference 0; tolerance 1e-9).</w:t>
       </w:r>
     </w:p>
     <w:p>

</xml_diff>